<commit_message>
fix: harden nursing necessity disease manual
</commit_message>
<xml_diff>
--- a/docs/admin/看護必要度_疾患別マニュアル.docx
+++ b/docs/admin/看護必要度_疾患別マニュアル.docx
@@ -207,6 +207,46 @@
       </w:tr>
     </w:tbl>
     <w:p>
+      <w:pPr>
+        <w:pStyle w:val="Heading1"/>
+      </w:pPr>
+      <w:r>
+        <w:t>🧾 制度コード照合メモ（2026-04-27 再確認）</w:t>
+      </w:r>
+    </w:p>
+    <w:p>
+      <w:pPr>
+        <w:pStyle w:val="ListBullet"/>
+      </w:pPr>
+      <w:r>
+        <w:t>C項目は処置名だけで断定せず、厚労省 別紙7別表1の診療行為コードと医事確認を最終根拠にする。</w:t>
+      </w:r>
+    </w:p>
+    <w:p>
+      <w:pPr>
+        <w:pStyle w:val="ListBullet"/>
+      </w:pPr>
+      <w:r>
+        <w:t>中心静脈注射用カテーテル挿入・腰椎穿刺・CHDF/PMX相当は C21（4日間）として確認。</w:t>
+      </w:r>
+    </w:p>
+    <w:p>
+      <w:pPr>
+        <w:pStyle w:val="ListBullet"/>
+      </w:pPr>
+      <w:r>
+        <w:t>PTCD（経皮的胆管ドレナージ）・PEG・CART・消化管ステントは C23（5日間）として確認。</w:t>
+      </w:r>
+    </w:p>
+    <w:p>
+      <w:pPr>
+        <w:pStyle w:val="ListBullet"/>
+      </w:pPr>
+      <w:r>
+        <w:t>尿管ステント、PCN、緊急デブリードマンなど、術式コードで揺れうるものはC項目候補として扱い、日数を医事と同日照合する。</w:t>
+      </w:r>
+    </w:p>
+    <w:p>
       <w:r>
         <w:br w:type="page"/>
       </w:r>
@@ -698,7 +738,7 @@
         <w:pStyle w:val="Heading3"/>
       </w:pPr>
       <w:r>
-        <w:t>💊 第一選択 vs 看護必要度貢献選択肢</w:t>
+        <w:t>💊 第一選択 vs 適応時に確認する項目</w:t>
       </w:r>
     </w:p>
     <w:tbl>
@@ -739,7 +779,7 @@
           </w:tcPr>
           <w:p>
             <w:r>
-              <w:t>看護必要度に貢献する選択肢</w:t>
+              <w:t>適応時に確認する項目</w:t>
             </w:r>
           </w:p>
         </w:tc>
@@ -803,7 +843,7 @@
           </w:tcPr>
           <w:p>
             <w:r>
-              <w:t>🟢 C23 CV 挿入 — A 項目ハブ・C 項目両取り</w:t>
+              <w:t>🟢 C21 CV 挿入 — 適応時に持続点滴・栄養管理と同日確認</w:t>
             </w:r>
           </w:p>
         </w:tc>
@@ -814,7 +854,7 @@
         <w:pStyle w:val="Heading3"/>
       </w:pPr>
       <w:r>
-        <w:t>📋 看護必要度寄与</w:t>
+        <w:t>📋 評価・記録上の確認点</w:t>
       </w:r>
     </w:p>
     <w:p>
@@ -838,7 +878,7 @@
         <w:pStyle w:val="ListBullet"/>
       </w:pPr>
       <w:r>
-        <w:t>🟢 C23 CV 挿入実施日: 4 日カウント (該当患者扱い)</w:t>
+        <w:t>🟢 C21 CV 挿入実施日: 4 日カウント (該当患者扱い)</w:t>
       </w:r>
     </w:p>
     <w:p>
@@ -910,7 +950,7 @@
         <w:pStyle w:val="ListBullet"/>
       </w:pPr>
       <w:r>
-        <w:t>看護必要度寄与: 🟠 A6③ 麻薬注射 **3 点** / 🟠 A4 シリンジポンプ 1 点 / 🟠 A3 注射薬剤 3 種類以上 1 点（フェンタニル + ラクテック + PPI）→ 入院初日 **A 計 5 点で該当**</w:t>
+        <w:t>評価・記録上の確認点: 🟠 A6③ 麻薬注射 **3 点** / 🟠 A4 シリンジポンプ 1 点 / 🟠 A3 注射薬剤 3 種類以上 1 点（フェンタニル + ラクテック + PPI）→ 入院初日 **A 計 5 点で該当**</w:t>
       </w:r>
     </w:p>
     <w:p>
@@ -974,7 +1014,7 @@
         <w:pStyle w:val="ListBullet"/>
       </w:pPr>
       <w:r>
-        <w:t>看護必要度寄与: 🟠 A6③ 麻薬注射 **3 点 × 5 日** / 🟠 A4 シリンジポンプ 1 点 / 🟠 A3 注射薬剤 3 種類以上 1 点 / 🟢 C23 CV 挿入 **4 日カウント該当患者扱い** / 感染合併で 🟠 A6⑦ 昇圧剤 **3 点** 追加可能性 → 圧倒的な該当患者</w:t>
+        <w:t>評価・記録上の確認点: 🟠 A6③ 麻薬注射 **3 点 × 5 日** / 🟠 A4 シリンジポンプ 1 点 / 🟠 A3 注射薬剤 3 種類以上 1 点 / 🟢 C21 CV 挿入 **4 日カウント該当患者扱い** / 感染合併で 🟠 A6⑦ 昇圧剤 **3 点** 追加可能性 → 評価根拠が明確な患者</w:t>
       </w:r>
     </w:p>
     <w:p>
@@ -1312,7 +1352,7 @@
         <w:pStyle w:val="Heading3"/>
       </w:pPr>
       <w:r>
-        <w:t>💊 第一選択 vs 看護必要度貢献選択肢</w:t>
+        <w:t>💊 第一選択 vs 適応時に確認する項目</w:t>
       </w:r>
     </w:p>
     <w:tbl>
@@ -1353,7 +1393,7 @@
           </w:tcPr>
           <w:p>
             <w:r>
-              <w:t>看護必要度に貢献する選択肢</w:t>
+              <w:t>適応時に確認する項目</w:t>
             </w:r>
           </w:p>
         </w:tc>
@@ -1417,7 +1457,7 @@
           </w:tcPr>
           <w:p>
             <w:r>
-              <w:t>🟢 C21③ PTCD（経皮経肝胆道ドレナージ） — 術後は 🟠 A6⑩ ドレナージ管理</w:t>
+              <w:t>🟢 C23 PTCD（経皮的胆管ドレナージ） — 術後は 🟠 A6⑩ ドレナージ管理、医事コードを同日照合</w:t>
             </w:r>
           </w:p>
         </w:tc>
@@ -1428,15 +1468,23 @@
         <w:pStyle w:val="Heading3"/>
       </w:pPr>
       <w:r>
-        <w:t>📋 看護必要度寄与</w:t>
-      </w:r>
-    </w:p>
-    <w:p>
-      <w:pPr>
-        <w:pStyle w:val="ListBullet"/>
-      </w:pPr>
-      <w:r>
-        <w:t>🟢 C21③ 侵襲的消化器治療: **4 日カウント** / 各処置</w:t>
+        <w:t>📋 評価・記録上の確認点</w:t>
+      </w:r>
+    </w:p>
+    <w:p>
+      <w:pPr>
+        <w:pStyle w:val="ListBullet"/>
+      </w:pPr>
+      <w:r>
+        <w:t>🟢 C21③ ERCP関連・内視鏡的胆道ステント: **4 日カウント** / 該当コードを医事確認</w:t>
+      </w:r>
+    </w:p>
+    <w:p>
+      <w:pPr>
+        <w:pStyle w:val="ListBullet"/>
+      </w:pPr>
+      <w:r>
+        <w:t>🟢 C23 PTCD（経皮的胆管ドレナージ）: **5 日カウント** / 該当コードを医事確認</w:t>
       </w:r>
     </w:p>
     <w:p>
@@ -1524,7 +1572,7 @@
         <w:pStyle w:val="ListBullet"/>
       </w:pPr>
       <w:r>
-        <w:t>看護必要度寄与: 🟠 A4 シリンジポンプ 1 点 / 🟠 A3 注射薬剤 3 種類以上 1 点 / 🟢 C21③ 侵襲的消化器治療 (ERCP) **4 日カウント該当患者扱い** / 🟠 A7 救急搬送後 2 点 → **A 計 4 点 + C 該当**</w:t>
+        <w:t>評価・記録上の確認点: 🟠 A4 シリンジポンプ 1 点 / 🟠 A3 注射薬剤 3 種類以上 1 点 / 🟢 C21③ 侵襲的消化器治療 (ERCP) **4 日カウント該当患者扱い** / 🟠 A7 救急搬送後 2 点 → **A 計 4 点 + C 該当**</w:t>
       </w:r>
     </w:p>
     <w:p>
@@ -1588,7 +1636,7 @@
         <w:pStyle w:val="ListBullet"/>
       </w:pPr>
       <w:r>
-        <w:t>看護必要度寄与: 🟠 A6⑦ 昇圧剤注射 **3 点** / 🟠 A4 シリンジポンプ 1 点 / 🟠 A3 注射薬剤 3 種類以上 1 点 / 🟢 C23 CV 挿入 4 日カウント / 🟢 C21③ PTCD 4 日カウント / 🟠 A6⑩ ドレナージ管理 (PTCD 後) 2 点 / 🟠 A7 救急搬送後 2 点 → **A 計 9 点 + C 該当 = 圧倒的な該当患者**</w:t>
+        <w:t>評価・記録上の確認点: 🟠 A6⑦ 昇圧剤注射 **3 点** / 🟠 A4 シリンジポンプ 1 点 / 🟠 A3 注射薬剤 3 種類以上 1 点 / 🟢 C21 CV 挿入 4 日カウント / 🟢 C23 PTCD 5 日カウント / 🟠 A6⑩ ドレナージ管理 (PTCD 後) 2 点 / 🟠 A7 救急搬送後 2 点 → **A 計 9 点 + C 該当 = 評価根拠が明確な患者**</w:t>
       </w:r>
     </w:p>
     <w:p>
@@ -2239,7 +2287,7 @@
         <w:pStyle w:val="Heading3"/>
       </w:pPr>
       <w:r>
-        <w:t>💊 第一選択 vs 看護必要度貢献選択肢</w:t>
+        <w:t>💊 第一選択 vs 適応時に確認する項目</w:t>
       </w:r>
     </w:p>
     <w:tbl>
@@ -2280,7 +2328,7 @@
           </w:tcPr>
           <w:p>
             <w:r>
-              <w:t>看護必要度に貢献する選択肢</w:t>
+              <w:t>適応時に確認する項目</w:t>
             </w:r>
           </w:p>
         </w:tc>
@@ -2355,7 +2403,7 @@
         <w:pStyle w:val="Heading3"/>
       </w:pPr>
       <w:r>
-        <w:t>📋 看護必要度寄与</w:t>
+        <w:t>📋 評価・記録上の確認点</w:t>
       </w:r>
     </w:p>
     <w:p>
@@ -2451,7 +2499,7 @@
         <w:pStyle w:val="ListBullet"/>
       </w:pPr>
       <w:r>
-        <w:t>看護必要度寄与: 🟢 C21③ 内視鏡的止血 4 日カウント / 🟠 A5 輸血管理 2 点 / 🟠 A4 シリンジポンプ (PPI 持続) 1 点 / 🟠 A3 注射薬剤 3 種類以上 1 点 / 🟠 A7 救急搬送後 2 点 → **A 計 6 点 + C 該当**</w:t>
+        <w:t>評価・記録上の確認点: 🟢 C21③ 内視鏡的止血 4 日カウント / 🟠 A5 輸血管理 2 点 / 🟠 A4 シリンジポンプ (PPI 持続) 1 点 / 🟠 A3 注射薬剤 3 種類以上 1 点 / 🟠 A7 救急搬送後 2 点 → **A 計 6 点 + C 該当**</w:t>
       </w:r>
     </w:p>
     <w:p>
@@ -2515,7 +2563,7 @@
         <w:pStyle w:val="ListBullet"/>
       </w:pPr>
       <w:r>
-        <w:t>看護必要度寄与: 🟠 A6⑦ 昇圧剤注射 **3 点** / 🟠 A5 輸血管理 2 点 / 🟢 C21③ 内視鏡的止血 4 日カウント / 🟢 C23 CV 挿入 4 日カウント / 🟠 A4 シリンジポンプ 1 点 / 🟠 A3 注射薬剤 3 種類以上 1 点 / 🟠 A7 救急搬送後 2 点 → **A 計 9 点 + C 該当 = 圧倒的な該当患者**</w:t>
+        <w:t>評価・記録上の確認点: 🟠 A6⑦ 昇圧剤注射 **3 点** / 🟠 A5 輸血管理 2 点 / 🟢 C21③ 内視鏡的止血 4 日カウント / 🟢 C21 CV 挿入 4 日カウント / 🟠 A4 シリンジポンプ 1 点 / 🟠 A3 注射薬剤 3 種類以上 1 点 / 🟠 A7 救急搬送後 2 点 → **A 計 9 点 + C 該当 = 評価根拠が明確な患者**</w:t>
       </w:r>
     </w:p>
     <w:p>
@@ -3030,7 +3078,7 @@
         <w:pStyle w:val="Heading3"/>
       </w:pPr>
       <w:r>
-        <w:t>💊 第一選択 vs 看護必要度貢献選択肢</w:t>
+        <w:t>💊 第一選択 vs 適応時に確認する項目</w:t>
       </w:r>
     </w:p>
     <w:tbl>
@@ -3071,7 +3119,7 @@
           </w:tcPr>
           <w:p>
             <w:r>
-              <w:t>看護必要度に貢献する選択肢</w:t>
+              <w:t>適応時に確認する項目</w:t>
             </w:r>
           </w:p>
         </w:tc>
@@ -3103,7 +3151,7 @@
           </w:tcPr>
           <w:p>
             <w:r>
-              <w:t>🟢 C21③ ESD / EMR — 適応症例で内視鏡的切除を積極化</w:t>
+              <w:t>🟢 C21③ ESD / EMR — 適応症例で内視鏡的切除を治療選択肢として確認</w:t>
             </w:r>
           </w:p>
         </w:tc>
@@ -3114,7 +3162,7 @@
         <w:pStyle w:val="Heading3"/>
       </w:pPr>
       <w:r>
-        <w:t>📋 看護必要度寄与</w:t>
+        <w:t>📋 評価・記録上の確認点</w:t>
       </w:r>
     </w:p>
     <w:p>
@@ -3202,7 +3250,7 @@
         <w:pStyle w:val="ListBullet"/>
       </w:pPr>
       <w:r>
-        <w:t>看護必要度寄与: 🟢 C21③ ESD **4 日カウント該当患者扱い** / 🟠 A1 創傷処置 (術後) 1 点 / 日（術後 1-2 日）→ **C 該当**</w:t>
+        <w:t>評価・記録上の確認点: 🟢 C21③ ESD **4 日カウント該当患者扱い** / 🟠 A1 創傷処置 (術後) 1 点 / 日（術後 1-2 日）→ **C 該当**</w:t>
       </w:r>
     </w:p>
     <w:p>
@@ -3797,7 +3845,7 @@
         <w:pStyle w:val="Heading3"/>
       </w:pPr>
       <w:r>
-        <w:t>💊 第一選択 vs 看護必要度貢献選択肢</w:t>
+        <w:t>💊 第一選択 vs 適応時に確認する項目</w:t>
       </w:r>
     </w:p>
     <w:tbl>
@@ -3838,7 +3886,7 @@
           </w:tcPr>
           <w:p>
             <w:r>
-              <w:t>看護必要度に貢献する選択肢</w:t>
+              <w:t>適応時に確認する項目</w:t>
             </w:r>
           </w:p>
         </w:tc>
@@ -3881,7 +3929,7 @@
         <w:pStyle w:val="Heading3"/>
       </w:pPr>
       <w:r>
-        <w:t>📋 看護必要度寄与</w:t>
+        <w:t>📋 評価・記録上の確認点</w:t>
       </w:r>
     </w:p>
     <w:p>
@@ -3969,7 +4017,7 @@
         <w:pStyle w:val="ListBullet"/>
       </w:pPr>
       <w:r>
-        <w:t>看護必要度寄与: 🟢 C23 PEG 造設 **5 日カウント該当患者扱い** / 🟠 A1 創傷処置 (PEG 創部) 1 点 / 日（術後 1 週間）→ **C 該当 + A 連日 1 点**</w:t>
+        <w:t>評価・記録上の確認点: 🟢 C23 PEG 造設 **5 日カウント該当患者扱い** / 🟠 A1 創傷処置 (PEG 創部) 1 点 / 日（術後 1 週間）→ **C 該当 + A 連日 1 点**</w:t>
       </w:r>
     </w:p>
     <w:p>
@@ -4396,7 +4444,7 @@
         <w:pStyle w:val="Heading3"/>
       </w:pPr>
       <w:r>
-        <w:t>💊 第一選択 vs 看護必要度貢献選択肢</w:t>
+        <w:t>💊 第一選択 vs 適応時に確認する項目</w:t>
       </w:r>
     </w:p>
     <w:tbl>
@@ -4437,7 +4485,7 @@
           </w:tcPr>
           <w:p>
             <w:r>
-              <w:t>看護必要度に貢献する選択肢</w:t>
+              <w:t>適応時に確認する項目</w:t>
             </w:r>
           </w:p>
         </w:tc>
@@ -4512,7 +4560,7 @@
         <w:pStyle w:val="Heading3"/>
       </w:pPr>
       <w:r>
-        <w:t>📋 看護必要度寄与</w:t>
+        <w:t>📋 評価・記録上の確認点</w:t>
       </w:r>
     </w:p>
     <w:p>
@@ -4600,7 +4648,7 @@
         <w:pStyle w:val="ListBullet"/>
       </w:pPr>
       <w:r>
-        <w:t>看護必要度寄与: 🟢 C17 開腹手術 **6 日カウント該当患者扱い** / 🟠 A6⑩ ドレナージ管理 2 点 / 🟠 A3 注射薬剤 3 種類以上 1 点 / 🟠 A1 創傷処置 (術後創部) 1 点 → **A 計 4 点 + C 該当**</w:t>
+        <w:t>評価・記録上の確認点: 🟢 C17 開腹手術 **6 日カウント該当患者扱い** / 🟠 A6⑩ ドレナージ管理 2 点 / 🟠 A3 注射薬剤 3 種類以上 1 点 / 🟠 A1 創傷処置 (術後創部) 1 点 → **A 計 4 点 + C 該当**</w:t>
       </w:r>
     </w:p>
     <w:p>
@@ -4664,7 +4712,7 @@
         <w:pStyle w:val="ListBullet"/>
       </w:pPr>
       <w:r>
-        <w:t>看護必要度寄与: 🟠 A6⑦ 昇圧剤注射 **3 点** / 🟢 C17 開腹手術 **6 日カウント** / 🟢 C23 CV 挿入 4 日カウント / 🟠 A6⑩ ドレナージ管理 (PCD) 2 点 / 🟠 A4 シリンジポンプ 1 点 / 🟠 A3 注射薬剤 3 種類以上 1 点 / 🟠 A2 呼吸ケア (HFNC) 1 点 / 🟠 A7 救急搬送後 2 点 → **A 計 10 点 + C 該当 = 圧倒的な該当患者**</w:t>
+        <w:t>評価・記録上の確認点: 🟠 A6⑦ 昇圧剤注射 **3 点** / 🟢 C17 開腹手術 **6 日カウント** / 🟢 C21 CV 挿入 4 日カウント / 🟠 A6⑩ ドレナージ管理 (PCD) 2 点 / 🟠 A4 シリンジポンプ 1 点 / 🟠 A3 注射薬剤 3 種類以上 1 点 / 🟠 A2 呼吸ケア (HFNC) 1 点 / 🟠 A7 救急搬送後 2 点 → **A 計 10 点 + C 該当 = 評価根拠が明確な患者**</w:t>
       </w:r>
     </w:p>
     <w:p>
@@ -4704,7 +4752,7 @@
         <w:pStyle w:val="ListBullet"/>
       </w:pPr>
       <w:r>
-        <w:t>ドレナージ可能な膿瘍は積極的に IR コンサルト</w:t>
+        <w:t>ドレナージ可能な膿瘍は IR コンサルトの適応を確認</w:t>
       </w:r>
     </w:p>
     <w:p>
@@ -5331,7 +5379,7 @@
         <w:pStyle w:val="Heading3"/>
       </w:pPr>
       <w:r>
-        <w:t>💊 第一選択 vs 看護必要度貢献選択肢</w:t>
+        <w:t>💊 第一選択 vs 適応時に確認する項目</w:t>
       </w:r>
     </w:p>
     <w:tbl>
@@ -5372,7 +5420,7 @@
           </w:tcPr>
           <w:p>
             <w:r>
-              <w:t>看護必要度に貢献する選択肢</w:t>
+              <w:t>適応時に確認する項目</w:t>
             </w:r>
           </w:p>
         </w:tc>
@@ -5447,7 +5495,7 @@
         <w:pStyle w:val="Heading3"/>
       </w:pPr>
       <w:r>
-        <w:t>📋 看護必要度寄与</w:t>
+        <w:t>📋 評価・記録上の確認点</w:t>
       </w:r>
     </w:p>
     <w:p>
@@ -5535,7 +5583,7 @@
         <w:pStyle w:val="ListBullet"/>
       </w:pPr>
       <w:r>
-        <w:t>看護必要度寄与: 🟠 A2 呼吸ケア (酸素) 1 点 / 🟠 A4 シリンジポンプ 1 点 / 🟠 A3 注射薬剤 3 種類以上 1 点 / 🟠 A7 救急搬送後 2 点（入院日と翌日） → 初日 **A 計 5 点で該当**</w:t>
+        <w:t>評価・記録上の確認点: 🟠 A2 呼吸ケア (酸素) 1 点 / 🟠 A4 シリンジポンプ 1 点 / 🟠 A3 注射薬剤 3 種類以上 1 点 / 🟠 A7 救急搬送後 2 点（入院日と翌日） → 初日 **A 計 5 点で該当**</w:t>
       </w:r>
     </w:p>
     <w:p>
@@ -5599,7 +5647,7 @@
         <w:pStyle w:val="ListBullet"/>
       </w:pPr>
       <w:r>
-        <w:t>看護必要度寄与: （転院前安定化中の当院での寄与）🟠 A6⑦ 昇圧剤注射 **3 点** / 🟠 A2 呼吸ケア (HFNC/NPPV) 1 点 / 🟠 A4 シリンジポンプ 1 点 / 🟠 A3 注射薬剤 3 種類以上 1 点 / 🟢 C23 CV 挿入 4 日カウント / 🟠 A7 救急搬送後 2 点 → **A 計 8 点 + C 該当 = 圧倒的な該当患者**</w:t>
+        <w:t>評価・記録上の確認点: （転院前安定化中の当院での評価確認）🟠 A6⑦ 昇圧剤注射 **3 点** / 🟠 A2 呼吸ケア (HFNC/NPPV) 1 点 / 🟠 A4 シリンジポンプ 1 点 / 🟠 A3 注射薬剤 3 種類以上 1 点 / 🟢 C21 CV 挿入 4 日カウント / 🟠 A7 救急搬送後 2 点 → **A 計 8 点 + C 該当 = 評価根拠が明確な患者**</w:t>
       </w:r>
     </w:p>
     <w:p>
@@ -6154,7 +6202,7 @@
         <w:pStyle w:val="Heading3"/>
       </w:pPr>
       <w:r>
-        <w:t>💊 第一選択 vs 看護必要度貢献選択肢</w:t>
+        <w:t>💊 第一選択 vs 適応時に確認する項目</w:t>
       </w:r>
     </w:p>
     <w:tbl>
@@ -6195,7 +6243,7 @@
           </w:tcPr>
           <w:p>
             <w:r>
-              <w:t>看護必要度に貢献する選択肢</w:t>
+              <w:t>適応時に確認する項目</w:t>
             </w:r>
           </w:p>
         </w:tc>
@@ -6227,7 +6275,7 @@
           </w:tcPr>
           <w:p>
             <w:r>
-              <w:t>🟠 A6⑩ 胸腔ドレナージ — 中等度以上で挿入閾値を下げる</w:t>
+              <w:t>🟠 A6⑩ 胸腔ドレナージ — 中等度以上で適応を再確認</w:t>
             </w:r>
           </w:p>
         </w:tc>
@@ -6238,7 +6286,7 @@
         <w:pStyle w:val="Heading3"/>
       </w:pPr>
       <w:r>
-        <w:t>📋 看護必要度寄与</w:t>
+        <w:t>📋 評価・記録上の確認点</w:t>
       </w:r>
     </w:p>
     <w:p>
@@ -6326,7 +6374,7 @@
         <w:pStyle w:val="ListBullet"/>
       </w:pPr>
       <w:r>
-        <w:t>看護必要度寄与: 🟠 A6⑩ ドレナージの管理 2 点 / 日（留置中毎日）/ 🟠 A1 創傷処置 (ドレーン創部) 1 点 / 🟠 A2 呼吸ケア (酸素) 1 点 → **A 計 4 点で該当**</w:t>
+        <w:t>評価・記録上の確認点: 🟠 A6⑩ ドレナージの管理 2 点 / 日（留置中毎日）/ 🟠 A1 創傷処置 (ドレーン創部) 1 点 / 🟠 A2 呼吸ケア (酸素) 1 点 → **A 計 4 点で該当**</w:t>
       </w:r>
     </w:p>
     <w:p>
@@ -6390,7 +6438,7 @@
         <w:pStyle w:val="ListBullet"/>
       </w:pPr>
       <w:r>
-        <w:t>看護必要度寄与: 🟠 A6⑩ ドレナージの管理 2 点 / 日 / 🟠 A2 呼吸ケア (HFNC) 1 点 / 🟠 A1 創傷処置 1 点 / 🟠 A7 救急搬送後 2 点 → **A 計 6 点で該当**</w:t>
+        <w:t>評価・記録上の確認点: 🟠 A6⑩ ドレナージの管理 2 点 / 日 / 🟠 A2 呼吸ケア (HFNC) 1 点 / 🟠 A1 創傷処置 1 点 / 🟠 A7 救急搬送後 2 点 → **A 計 6 点で該当**</w:t>
       </w:r>
     </w:p>
     <w:p>
@@ -7017,7 +7065,7 @@
         <w:pStyle w:val="Heading3"/>
       </w:pPr>
       <w:r>
-        <w:t>💊 第一選択 vs 看護必要度貢献選択肢</w:t>
+        <w:t>💊 第一選択 vs 適応時に確認する項目</w:t>
       </w:r>
     </w:p>
     <w:tbl>
@@ -7058,7 +7106,7 @@
           </w:tcPr>
           <w:p>
             <w:r>
-              <w:t>看護必要度に貢献する選択肢</w:t>
+              <w:t>適応時に確認する項目</w:t>
             </w:r>
           </w:p>
         </w:tc>
@@ -7101,7 +7149,7 @@
         <w:pStyle w:val="Heading3"/>
       </w:pPr>
       <w:r>
-        <w:t>📋 看護必要度寄与</w:t>
+        <w:t>📋 評価・記録上の確認点</w:t>
       </w:r>
     </w:p>
     <w:p>
@@ -7189,7 +7237,7 @@
         <w:pStyle w:val="ListBullet"/>
       </w:pPr>
       <w:r>
-        <w:t>看護必要度寄与: 🟠 A6⑨ 抗血栓塞栓薬の持続点滴 **3 点** / 🟠 A4 シリンジポンプ 1 点 / 🟠 A2 呼吸ケア (酸素) 1 点 / 🟠 A7 救急搬送後 2 点 → **A 計 7 点で該当**</w:t>
+        <w:t>評価・記録上の確認点: 🟠 A6⑨ 抗血栓塞栓薬の持続点滴 **3 点** / 🟠 A4 シリンジポンプ 1 点 / 🟠 A2 呼吸ケア (酸素) 1 点 / 🟠 A7 救急搬送後 2 点 → **A 計 7 点で該当**</w:t>
       </w:r>
     </w:p>
     <w:p>
@@ -7253,7 +7301,7 @@
         <w:pStyle w:val="ListBullet"/>
       </w:pPr>
       <w:r>
-        <w:t>看護必要度寄与: （転院前安定化中）🟠 A6⑦ 昇圧剤注射 **3 点** / 🟠 A6⑨ 抗血栓塞栓薬の持続点滴 **3 点** / 🟠 A4 シリンジポンプ 1 点 / 🟠 A2 呼吸ケア (HFNC) 1 点 / 🟢 C23 CV 挿入 4 日カウント / 🟠 A7 救急搬送後 2 点 → **A 計 10 点 + C 該当 = 圧倒的な該当患者**</w:t>
+        <w:t>評価・記録上の確認点: （転院前安定化中）🟠 A6⑦ 昇圧剤注射 **3 点** / 🟠 A6⑨ 抗血栓塞栓薬の持続点滴 **3 点** / 🟠 A4 シリンジポンプ 1 点 / 🟠 A2 呼吸ケア (HFNC) 1 点 / 🟢 C21 CV 挿入 4 日カウント / 🟠 A7 救急搬送後 2 点 → **A 計 10 点 + C 該当 = 評価根拠が明確な患者**</w:t>
       </w:r>
     </w:p>
     <w:p>
@@ -8000,7 +8048,7 @@
         <w:pStyle w:val="Heading3"/>
       </w:pPr>
       <w:r>
-        <w:t>💊 第一選択 vs 看護必要度貢献選択肢</w:t>
+        <w:t>💊 第一選択 vs 適応時に確認する項目</w:t>
       </w:r>
     </w:p>
     <w:tbl>
@@ -8041,7 +8089,7 @@
           </w:tcPr>
           <w:p>
             <w:r>
-              <w:t>看護必要度に貢献する選択肢</w:t>
+              <w:t>適応時に確認する項目</w:t>
             </w:r>
           </w:p>
         </w:tc>
@@ -8084,7 +8132,7 @@
         <w:pStyle w:val="Heading3"/>
       </w:pPr>
       <w:r>
-        <w:t>📋 看護必要度寄与</w:t>
+        <w:t>📋 評価・記録上の確認点</w:t>
       </w:r>
     </w:p>
     <w:p>
@@ -8172,7 +8220,7 @@
         <w:pStyle w:val="ListBullet"/>
       </w:pPr>
       <w:r>
-        <w:t>看護必要度寄与: 🟠 A6⑧ 抗不整脈剤注射 **3 点** / 🟠 A4 シリンジポンプ 1 点 / 🟠 A3 注射薬剤 3 種類以上 1 点 / 🟠 A2 呼吸ケア (酸素) 1 点 / 🟠 A7 救急搬送後 2 点 → **A 計 8 点で該当**</w:t>
+        <w:t>評価・記録上の確認点: 🟠 A6⑧ 抗不整脈剤注射 **3 点** / 🟠 A4 シリンジポンプ 1 点 / 🟠 A3 注射薬剤 3 種類以上 1 点 / 🟠 A2 呼吸ケア (酸素) 1 点 / 🟠 A7 救急搬送後 2 点 → **A 計 8 点で該当**</w:t>
       </w:r>
     </w:p>
     <w:p>
@@ -8775,7 +8823,7 @@
         <w:pStyle w:val="Heading3"/>
       </w:pPr>
       <w:r>
-        <w:t>💊 第一選択 vs 看護必要度貢献選択肢</w:t>
+        <w:t>💊 第一選択 vs 適応時に確認する項目</w:t>
       </w:r>
     </w:p>
     <w:tbl>
@@ -8816,7 +8864,7 @@
           </w:tcPr>
           <w:p>
             <w:r>
-              <w:t>看護必要度に貢献する選択肢</w:t>
+              <w:t>適応時に確認する項目</w:t>
             </w:r>
           </w:p>
         </w:tc>
@@ -8891,7 +8939,7 @@
         <w:pStyle w:val="Heading3"/>
       </w:pPr>
       <w:r>
-        <w:t>📋 看護必要度寄与</w:t>
+        <w:t>📋 評価・記録上の確認点</w:t>
       </w:r>
     </w:p>
     <w:p>
@@ -9003,7 +9051,7 @@
         <w:pStyle w:val="ListBullet"/>
       </w:pPr>
       <w:r>
-        <w:t>看護必要度寄与: 🟠 A4 シリンジポンプ管理 (NTG 持続) 1 点 / 🟠 A3 注射薬剤 3 種類以上 (NTG + フロセミド + 補液) 1 点 / 🟠 A2 呼吸ケア (酸素) 1 点 / 🟠 A7 救急搬送後 2 点（入院日と翌日）→ 入院日 **A 計 5 点で該当**、NTG 継続中は連日 A4+A3=2 点で該当維持</w:t>
+        <w:t>評価・記録上の確認点: 🟠 A4 シリンジポンプ管理 (NTG 持続) 1 点 / 🟠 A3 注射薬剤 3 種類以上 (NTG + フロセミド + 補液) 1 点 / 🟠 A2 呼吸ケア (酸素) 1 点 / 🟠 A7 救急搬送後 2 点（入院日と翌日）→ 入院日 **A 計 5 点で該当**、NTG 継続中は連日 A4+A3=2 点で該当維持</w:t>
       </w:r>
     </w:p>
     <w:p>
@@ -9067,7 +9115,7 @@
         <w:pStyle w:val="ListBullet"/>
       </w:pPr>
       <w:r>
-        <w:t>看護必要度寄与: 🟠 A6⑦ 昇圧剤注射 (NE 持続) **3 点** / 🟠 A4 シリンジポンプ 1 点 / 🟠 A3 注射薬剤 3 種類以上 1 点 / 🟠 A2 呼吸ケア (酸素・NPPV) 1 点 / 🟢 C23 CV 挿入 4 日カウント / 🟠 A7 救急搬送後 2 点 → **A 計 8 点 + C 該当 = 圧倒的な該当患者**</w:t>
+        <w:t>評価・記録上の確認点: 🟠 A6⑦ 昇圧剤注射 (NE 持続) **3 点** / 🟠 A4 シリンジポンプ 1 点 / 🟠 A3 注射薬剤 3 種類以上 1 点 / 🟠 A2 呼吸ケア (酸素・NPPV) 1 点 / 🟢 C21 CV 挿入 4 日カウント / 🟠 A7 救急搬送後 2 点 → **A 計 8 点 + C 該当 = 評価根拠が明確な患者**</w:t>
       </w:r>
     </w:p>
     <w:p>
@@ -9598,7 +9646,7 @@
         <w:pStyle w:val="Heading3"/>
       </w:pPr>
       <w:r>
-        <w:t>💊 第一選択 vs 看護必要度貢献選択肢</w:t>
+        <w:t>💊 第一選択 vs 適応時に確認する項目</w:t>
       </w:r>
     </w:p>
     <w:tbl>
@@ -9639,7 +9687,7 @@
           </w:tcPr>
           <w:p>
             <w:r>
-              <w:t>看護必要度に貢献する選択肢</w:t>
+              <w:t>適応時に確認する項目</w:t>
             </w:r>
           </w:p>
         </w:tc>
@@ -9714,7 +9762,7 @@
         <w:pStyle w:val="Heading3"/>
       </w:pPr>
       <w:r>
-        <w:t>📋 看護必要度寄与</w:t>
+        <w:t>📋 評価・記録上の確認点</w:t>
       </w:r>
     </w:p>
     <w:p>
@@ -9802,7 +9850,7 @@
         <w:pStyle w:val="ListBullet"/>
       </w:pPr>
       <w:r>
-        <w:t>看護必要度寄与: 🟠 A3 注射薬剤 3 種類以上 (抗菌薬 + 輸液 + 補正剤) 1 点 / 🟠 A7 救急搬送後 2 点 → 入院日 **A 計 3 点で該当**。昇圧剤不要のため A6⑦ なし</w:t>
+        <w:t>評価・記録上の確認点: 🟠 A3 注射薬剤 3 種類以上 (抗菌薬 + 輸液 + 補正剤) 1 点 / 🟠 A7 救急搬送後 2 点 → 入院日 **A 計 3 点で該当**。昇圧剤不要のため A6⑦ なし</w:t>
       </w:r>
     </w:p>
     <w:p>
@@ -9866,7 +9914,7 @@
         <w:pStyle w:val="ListBullet"/>
       </w:pPr>
       <w:r>
-        <w:t>看護必要度寄与: 🟠 A6⑦ 昇圧剤注射 (NE 持続) **3 点** / 🟠 A4 シリンジポンプ (NE + MEPM 持続) 1 点 / 🟠 A3 注射薬剤 3 種類以上 1 点 / 🟢 C23 CV 挿入 **4 日カウント該当患者扱い** / 🟠 A7 救急搬送後 2 点 → **A 計 7 点 + C 該当 = 圧倒的な該当患者**</w:t>
+        <w:t>評価・記録上の確認点: 🟠 A6⑦ 昇圧剤注射 (NE 持続) **3 点** / 🟠 A4 シリンジポンプ (NE + MEPM 持続) 1 点 / 🟠 A3 注射薬剤 3 種類以上 1 点 / 🟢 C21 CV 挿入 **4 日カウント該当患者扱い** / 🟠 A7 救急搬送後 2 点 → **A 計 7 点 + C 該当 = 評価根拠が明確な患者**</w:t>
       </w:r>
     </w:p>
     <w:p>
@@ -10348,7 +10396,7 @@
         <w:pStyle w:val="Heading3"/>
       </w:pPr>
       <w:r>
-        <w:t>💊 第一選択 vs 看護必要度貢献選択肢</w:t>
+        <w:t>💊 第一選択 vs 適応時に確認する項目</w:t>
       </w:r>
     </w:p>
     <w:tbl>
@@ -10389,7 +10437,7 @@
           </w:tcPr>
           <w:p>
             <w:r>
-              <w:t>看護必要度に貢献する選択肢</w:t>
+              <w:t>適応時に確認する項目</w:t>
             </w:r>
           </w:p>
         </w:tc>
@@ -10432,7 +10480,7 @@
         <w:pStyle w:val="Heading3"/>
       </w:pPr>
       <w:r>
-        <w:t>📋 看護必要度寄与</w:t>
+        <w:t>📋 評価・記録上の確認点</w:t>
       </w:r>
     </w:p>
     <w:p>
@@ -10520,7 +10568,7 @@
         <w:pStyle w:val="ListBullet"/>
       </w:pPr>
       <w:r>
-        <w:t>看護必要度寄与: 🟠 A4 シリンジポンプ (PIPC/TAZ 持続) 1 点 / 🟠 A3 注射薬剤 3 種類以上 1 点 / 🟠 A7 救急搬送後 2 点 → **A 計 4 点で該当**</w:t>
+        <w:t>評価・記録上の確認点: 🟠 A4 シリンジポンプ (PIPC/TAZ 持続) 1 点 / 🟠 A3 注射薬剤 3 種類以上 1 点 / 🟠 A7 救急搬送後 2 点 → **A 計 4 点で該当**</w:t>
       </w:r>
     </w:p>
     <w:p>
@@ -10995,7 +11043,7 @@
         <w:pStyle w:val="Heading3"/>
       </w:pPr>
       <w:r>
-        <w:t>💊 第一選択 vs 看護必要度貢献選択肢</w:t>
+        <w:t>💊 第一選択 vs 適応時に確認する項目</w:t>
       </w:r>
     </w:p>
     <w:tbl>
@@ -11036,7 +11084,7 @@
           </w:tcPr>
           <w:p>
             <w:r>
-              <w:t>看護必要度に貢献する選択肢</w:t>
+              <w:t>適応時に確認する項目</w:t>
             </w:r>
           </w:p>
         </w:tc>
@@ -11079,7 +11127,7 @@
         <w:pStyle w:val="Heading3"/>
       </w:pPr>
       <w:r>
-        <w:t>📋 看護必要度寄与</w:t>
+        <w:t>📋 評価・記録上の確認点</w:t>
       </w:r>
     </w:p>
     <w:p>
@@ -11159,7 +11207,7 @@
         <w:pStyle w:val="ListBullet"/>
       </w:pPr>
       <w:r>
-        <w:t>看護必要度寄与: 🟠 A4 シリンジポンプ (MEPM 持続) 1 点 / 🟠 A3 注射薬剤 3 種類以上 1 点 / 🟠 A7 救急搬送後 2 点 → **A 計 4 点で該当**</w:t>
+        <w:t>評価・記録上の確認点: 🟠 A4 シリンジポンプ (MEPM 持続) 1 点 / 🟠 A3 注射薬剤 3 種類以上 1 点 / 🟠 A7 救急搬送後 2 点 → **A 計 4 点で該当**</w:t>
       </w:r>
     </w:p>
     <w:p>
@@ -11223,7 +11271,7 @@
         <w:pStyle w:val="ListBullet"/>
       </w:pPr>
       <w:r>
-        <w:t>看護必要度寄与: 🟠 A4 シリンジポンプ 1 点 / 🟠 A3 注射薬剤 3 種類以上 1 点 / 🟢 C23 尿管ステント or PCN 4 日カウント / 🟠 A6⑩ ドレナージ管理 (PCN 後) 2 点 / 🟠 A7 救急搬送後 2 点 → **A 計 6 点 + C 該当**</w:t>
+        <w:t>評価・記録上の確認点: 🟠 A4 シリンジポンプ 1 点 / 🟠 A3 注射薬剤 3 種類以上 1 点 / 🟢 C項目候補: 尿管ステント / PCN（術式コード要照合） / 🟠 A6⑩ ドレナージ管理 (PCN 後) 2 点 / 🟠 A7 救急搬送後 2 点 → **A 計 6 点 + C候補は医事照合**</w:t>
       </w:r>
     </w:p>
     <w:p>
@@ -11882,7 +11930,7 @@
         <w:pStyle w:val="Heading3"/>
       </w:pPr>
       <w:r>
-        <w:t>💊 第一選択 vs 看護必要度貢献選択肢</w:t>
+        <w:t>💊 第一選択 vs 適応時に確認する項目</w:t>
       </w:r>
     </w:p>
     <w:tbl>
@@ -11923,7 +11971,7 @@
           </w:tcPr>
           <w:p>
             <w:r>
-              <w:t>看護必要度に貢献する選択肢</w:t>
+              <w:t>適応時に確認する項目</w:t>
             </w:r>
           </w:p>
         </w:tc>
@@ -11966,7 +12014,7 @@
         <w:pStyle w:val="Heading3"/>
       </w:pPr>
       <w:r>
-        <w:t>📋 看護必要度寄与</w:t>
+        <w:t>📋 評価・記録上の確認点</w:t>
       </w:r>
     </w:p>
     <w:p>
@@ -12046,7 +12094,7 @@
         <w:pStyle w:val="ListBullet"/>
       </w:pPr>
       <w:r>
-        <w:t>看護必要度寄与: 🟠 A1 創傷処置 1 点 / 🟠 A3 注射薬剤 3 種類以上 1 点（IV 抗菌薬 + 輸液 + 鎮痛薬）/ 🟠 A7 救急搬送後 2 点 → **A 計 4 点で該当**</w:t>
+        <w:t>評価・記録上の確認点: 🟠 A1 創傷処置 1 点 / 🟠 A3 注射薬剤 3 種類以上 1 点（IV 抗菌薬 + 輸液 + 鎮痛薬）/ 🟠 A7 救急搬送後 2 点 → **A 計 4 点で該当**</w:t>
       </w:r>
     </w:p>
     <w:p>
@@ -12110,7 +12158,7 @@
         <w:pStyle w:val="ListBullet"/>
       </w:pPr>
       <w:r>
-        <w:t>看護必要度寄与: 🟠 A6⑦ 昇圧剤 **3 点** / 🟢 C23 緊急デブリードマン 4 日カウント / 🟢 C23 CV 挿入 4 日カウント / 🟠 A4 シリンジポンプ 1 点 / 🟠 A3 注射薬剤 3 種類以上 1 点 / 🟠 A2 呼吸ケア (HFNC) 1 点 / 🟠 A1 創傷処置 1 点 / 🟠 A7 救急搬送後 2 点 → **A 計 9 点 + C 該当 = 圧倒的な該当患者**</w:t>
+        <w:t>評価・記録上の確認点: 🟠 A6⑦ 昇圧剤 **3 点** / 🟢 C項目候補: 緊急デブリードマン（術式コード要照合） / 🟢 C21 CV 挿入 4 日カウント / 🟠 A4 シリンジポンプ 1 点 / 🟠 A3 注射薬剤 3 種類以上 1 点 / 🟠 A2 呼吸ケア (HFNC) 1 点 / 🟠 A1 創傷処置 1 点 / 🟠 A7 救急搬送後 2 点 → **A 計 9 点 + C候補は医事照合 = 評価根拠が明確な患者**</w:t>
       </w:r>
     </w:p>
     <w:p>
@@ -12769,7 +12817,7 @@
         <w:pStyle w:val="Heading3"/>
       </w:pPr>
       <w:r>
-        <w:t>💊 第一選択 vs 看護必要度貢献選択肢</w:t>
+        <w:t>💊 第一選択 vs 適応時に確認する項目</w:t>
       </w:r>
     </w:p>
     <w:tbl>
@@ -12810,7 +12858,7 @@
           </w:tcPr>
           <w:p>
             <w:r>
-              <w:t>看護必要度に貢献する選択肢</w:t>
+              <w:t>適応時に確認する項目</w:t>
             </w:r>
           </w:p>
         </w:tc>
@@ -12853,7 +12901,7 @@
         <w:pStyle w:val="Heading3"/>
       </w:pPr>
       <w:r>
-        <w:t>📋 看護必要度寄与</w:t>
+        <w:t>📋 評価・記録上の確認点</w:t>
       </w:r>
     </w:p>
     <w:p>
@@ -12941,7 +12989,7 @@
         <w:pStyle w:val="ListBullet"/>
       </w:pPr>
       <w:r>
-        <w:t>看護必要度寄与: 🟠 A1 創傷処置 1 点 / 🟠 A3 注射薬剤 3 種類以上 1 点（ABPC/SBT + 輸液 + インスリン）/ 🟠 A7 救急搬送後 or 緊急入院 2 点 → **A 計 4 点で該当**</w:t>
+        <w:t>評価・記録上の確認点: 🟠 A1 創傷処置 1 点 / 🟠 A3 注射薬剤 3 種類以上 1 点（ABPC/SBT + 輸液 + インスリン）/ 🟠 A7 救急搬送後 or 緊急入院 2 点 → **A 計 4 点で該当**</w:t>
       </w:r>
     </w:p>
     <w:p>
@@ -13005,7 +13053,7 @@
         <w:pStyle w:val="ListBullet"/>
       </w:pPr>
       <w:r>
-        <w:t>看護必要度寄与: 🟠 A6⑦ 昇圧剤 **3 点** / 🟢 C18 骨の手術 (切断) **10 日カウント** / 🟢 C23 CV 挿入 4 日 / 🟠 A4 シリンジポンプ 1 点 / 🟠 A3 注射薬剤 3 種類以上 1 点 / 🟠 A2 呼吸ケア (HFNC) 1 点 / 🟠 A1 創傷処置 1 点 / 🟠 A7 救急搬送後 2 点 → **A 計 9 点 + C 該当 = 圧倒的な該当患者**</w:t>
+        <w:t>評価・記録上の確認点: 🟠 A6⑦ 昇圧剤 **3 点** / 🟢 C18 骨の手術 (切断) **10 日カウント** / 🟢 C21 CV 挿入 4 日 / 🟠 A4 シリンジポンプ 1 点 / 🟠 A3 注射薬剤 3 種類以上 1 点 / 🟠 A2 呼吸ケア (HFNC) 1 点 / 🟠 A1 創傷処置 1 点 / 🟠 A7 救急搬送後 2 点 → **A 計 9 点 + C 該当 = 評価根拠が明確な患者**</w:t>
       </w:r>
     </w:p>
     <w:p>
@@ -13761,7 +13809,7 @@
         <w:pStyle w:val="Heading3"/>
       </w:pPr>
       <w:r>
-        <w:t>💊 第一選択 vs 看護必要度貢献選択肢</w:t>
+        <w:t>💊 第一選択 vs 適応時に確認する項目</w:t>
       </w:r>
     </w:p>
     <w:tbl>
@@ -13802,7 +13850,7 @@
           </w:tcPr>
           <w:p>
             <w:r>
-              <w:t>看護必要度に貢献する選択肢</w:t>
+              <w:t>適応時に確認する項目</w:t>
             </w:r>
           </w:p>
         </w:tc>
@@ -13845,7 +13893,7 @@
         <w:pStyle w:val="Heading3"/>
       </w:pPr>
       <w:r>
-        <w:t>📋 看護必要度寄与</w:t>
+        <w:t>📋 評価・記録上の確認点</w:t>
       </w:r>
     </w:p>
     <w:p>
@@ -13933,7 +13981,7 @@
         <w:pStyle w:val="ListBullet"/>
       </w:pPr>
       <w:r>
-        <w:t>看護必要度寄与: 🟠 A6⑧ 抗不整脈剤注射 (リドカイン持続) **3 点 / 日 × 1-3 日** / 🟠 A4 シリンジポンプ 1 点 → **A 計 4 点で該当**（治療効果あり継続中）</w:t>
+        <w:t>評価・記録上の確認点: 🟠 A6⑧ 抗不整脈剤注射 (リドカイン持続) **3 点 / 日 × 1-3 日** / 🟠 A4 シリンジポンプ 1 点 → **A 計 4 点で該当**（治療効果あり継続中）</w:t>
       </w:r>
     </w:p>
     <w:p>

</xml_diff>